<commit_message>
1.1 fix and 1.2 Done
</commit_message>
<xml_diff>
--- a/Assignment_2_documentation.docx
+++ b/Assignment_2_documentation.docx
@@ -91,15 +91,14 @@
     <w:p>
       <w:pPr>
         <w:pStyle w:val="Cmlapkarstanszk"/>
-        <w:rPr>
-          <w:lang w:val="de-DE"/>
-        </w:rPr>
-      </w:pPr>
-      <w:r>
-        <w:rPr>
-          <w:lang w:val="de-DE"/>
-        </w:rPr>
-        <w:t>Systemsicherheit (211011-SS 2026)</w:t>
+      </w:pPr>
+      <w:proofErr w:type="spellStart"/>
+      <w:r>
+        <w:t>Systemsicherheit</w:t>
+      </w:r>
+      <w:proofErr w:type="spellEnd"/>
+      <w:r>
+        <w:t xml:space="preserve"> (211011-SS 2026)</w:t>
       </w:r>
     </w:p>
     <w:p/>
@@ -146,6 +145,7 @@
         <w:pStyle w:val="Cmlapszerz"/>
         <w:rPr>
           <w:noProof w:val="0"/>
+          <w:color w:val="FF0000"/>
         </w:rPr>
       </w:pPr>
       <w:r>
@@ -154,6 +154,19 @@
         </w:rPr>
         <w:t>Matias</w:t>
       </w:r>
+      <w:r>
+        <w:rPr>
+          <w:noProof w:val="0"/>
+        </w:rPr>
+        <w:t xml:space="preserve"> </w:t>
+      </w:r>
+      <w:r>
+        <w:rPr>
+          <w:noProof w:val="0"/>
+          <w:color w:val="FF0000"/>
+        </w:rPr>
+        <w:t>Replace</w:t>
+      </w:r>
     </w:p>
     <w:p>
       <w:pPr>
@@ -167,6 +180,19 @@
           <w:noProof w:val="0"/>
         </w:rPr>
         <w:t>Matej</w:t>
+      </w:r>
+      <w:r>
+        <w:rPr>
+          <w:noProof w:val="0"/>
+        </w:rPr>
+        <w:t xml:space="preserve"> </w:t>
+      </w:r>
+      <w:r>
+        <w:rPr>
+          <w:noProof w:val="0"/>
+          <w:color w:val="FF0000"/>
+        </w:rPr>
+        <w:t>Replace</w:t>
       </w:r>
     </w:p>
     <w:p>
@@ -359,10 +385,7 @@
         <w:t>B</w:t>
       </w:r>
       <w:r>
-        <w:t>}</w:t>
-      </w:r>
-      <w:r>
-        <w:t>K</w:t>
+        <w:t>}K</w:t>
       </w:r>
       <w:r>
         <w:rPr>
@@ -401,10 +424,10 @@
           <w:noProof/>
         </w:rPr>
         <w:drawing>
-          <wp:inline distT="0" distB="0" distL="0" distR="0" wp14:anchorId="57648B0D" wp14:editId="7BD729DB">
-            <wp:extent cx="5400040" cy="1189990"/>
-            <wp:effectExtent l="0" t="0" r="0" b="0"/>
-            <wp:docPr id="646225515" name="Picture 1"/>
+          <wp:inline distT="0" distB="0" distL="0" distR="0" wp14:anchorId="4E6A203B" wp14:editId="52489D23">
+            <wp:extent cx="5400040" cy="1942872"/>
+            <wp:effectExtent l="0" t="0" r="0" b="635"/>
+            <wp:docPr id="1425934410" name="Picture 2"/>
             <wp:cNvGraphicFramePr>
               <a:graphicFrameLocks xmlns:a="http://schemas.openxmlformats.org/drawingml/2006/main" noChangeAspect="1"/>
             </wp:cNvGraphicFramePr>
@@ -412,8 +435,10 @@
               <a:graphicData uri="http://schemas.openxmlformats.org/drawingml/2006/picture">
                 <pic:pic xmlns:pic="http://schemas.openxmlformats.org/drawingml/2006/picture">
                   <pic:nvPicPr>
-                    <pic:cNvPr id="646225515" name="Picture 646225515"/>
-                    <pic:cNvPicPr/>
+                    <pic:cNvPr id="0" name="Picture 1"/>
+                    <pic:cNvPicPr>
+                      <a:picLocks noChangeAspect="1" noChangeArrowheads="1"/>
+                    </pic:cNvPicPr>
                   </pic:nvPicPr>
                   <pic:blipFill>
                     <a:blip r:embed="rId12">
@@ -423,6 +448,161 @@
                         </a:ext>
                       </a:extLst>
                     </a:blip>
+                    <a:srcRect/>
+                    <a:stretch>
+                      <a:fillRect/>
+                    </a:stretch>
+                  </pic:blipFill>
+                  <pic:spPr bwMode="auto">
+                    <a:xfrm>
+                      <a:off x="0" y="0"/>
+                      <a:ext cx="5400040" cy="1942872"/>
+                    </a:xfrm>
+                    <a:prstGeom prst="rect">
+                      <a:avLst/>
+                    </a:prstGeom>
+                    <a:noFill/>
+                    <a:ln>
+                      <a:noFill/>
+                    </a:ln>
+                  </pic:spPr>
+                </pic:pic>
+              </a:graphicData>
+            </a:graphic>
+          </wp:inline>
+        </w:drawing>
+      </w:r>
+    </w:p>
+    <w:p>
+      <w:r>
+        <w:t>As indicated in the protocol flow</w:t>
+      </w:r>
+      <w:r>
+        <w:t xml:space="preserve"> chart,</w:t>
+      </w:r>
+      <w:r>
+        <w:t xml:space="preserve"> Eve can intercept Alice’s first message to the server and replace Bob’s ID with her own. The server </w:t>
+      </w:r>
+      <w:r>
+        <w:t xml:space="preserve">then </w:t>
+      </w:r>
+      <w:r>
+        <w:t xml:space="preserve">generates the </w:t>
+      </w:r>
+      <w:r>
+        <w:t>session key</w:t>
+      </w:r>
+      <w:r>
+        <w:t xml:space="preserve"> K</w:t>
+      </w:r>
+      <w:r>
+        <w:rPr>
+          <w:vertAlign w:val="subscript"/>
+        </w:rPr>
+        <w:t>AE</w:t>
+      </w:r>
+      <w:r>
+        <w:t xml:space="preserve">, but now it </w:t>
+      </w:r>
+      <w:r>
+        <w:t>is for Alice and</w:t>
+      </w:r>
+      <w:r>
+        <w:t xml:space="preserve"> Eve. </w:t>
+      </w:r>
+      <w:r>
+        <w:t>F</w:t>
+      </w:r>
+      <w:r>
+        <w:t>rom this point onwards</w:t>
+      </w:r>
+      <w:r>
+        <w:t xml:space="preserve">, Eve </w:t>
+      </w:r>
+      <w:r>
+        <w:t>could</w:t>
+      </w:r>
+      <w:r>
+        <w:t xml:space="preserve"> read any message </w:t>
+      </w:r>
+      <w:r>
+        <w:t xml:space="preserve">coming </w:t>
+      </w:r>
+      <w:r>
+        <w:t>from Alice and c</w:t>
+      </w:r>
+      <w:r>
+        <w:t>ould</w:t>
+      </w:r>
+      <w:r>
+        <w:t xml:space="preserve"> impersonate Bob whenever she likes</w:t>
+      </w:r>
+      <w:r>
+        <w:t>.</w:t>
+      </w:r>
+    </w:p>
+    <w:p>
+      <w:r>
+        <w:t xml:space="preserve">To trick Bob as well </w:t>
+      </w:r>
+      <w:r>
+        <w:t>she starts another session but now with Bob</w:t>
+      </w:r>
+      <w:r>
+        <w:t>. This way she gets the key K</w:t>
+      </w:r>
+      <w:r>
+        <w:rPr>
+          <w:vertAlign w:val="subscript"/>
+        </w:rPr>
+        <w:t>EB</w:t>
+      </w:r>
+      <w:r>
+        <w:t xml:space="preserve"> to talk to Bob. Eve can then send this key to Alice as a disguised server response, so that Alice thinks that this is her session key with Bob. She then sends this to Bob, and now the session that he will use can also be </w:t>
+      </w:r>
+      <w:r>
+        <w:t>decrypted</w:t>
+      </w:r>
+      <w:r>
+        <w:t xml:space="preserve"> by Eve.</w:t>
+      </w:r>
+    </w:p>
+    <w:p>
+      <w:pPr>
+        <w:pStyle w:val="Heading2"/>
+      </w:pPr>
+      <w:r>
+        <w:t>Authentication II</w:t>
+      </w:r>
+    </w:p>
+    <w:p>
+      <w:r>
+        <w:t>The issue with this protocol is that nonce that checks the liveness of the connection between Alice and the Server is not included in the initial message to Bob. This means that Bob has no way of checking the liveness of that message, an assumes that it is correct. Thus, Eve can hijack the conversation and take the role of Alice to fool Bob.</w:t>
+      </w:r>
+    </w:p>
+    <w:p>
+      <w:pPr>
+        <w:pStyle w:val="Picture"/>
+      </w:pPr>
+      <w:r>
+        <w:lastRenderedPageBreak/>
+        <w:drawing>
+          <wp:inline distT="0" distB="0" distL="0" distR="0" wp14:anchorId="1BAEEFF8" wp14:editId="130CEF71">
+            <wp:extent cx="5400040" cy="1419860"/>
+            <wp:effectExtent l="0" t="0" r="0" b="8890"/>
+            <wp:docPr id="594937071" name="Picture 1"/>
+            <wp:cNvGraphicFramePr>
+              <a:graphicFrameLocks xmlns:a="http://schemas.openxmlformats.org/drawingml/2006/main" noChangeAspect="1"/>
+            </wp:cNvGraphicFramePr>
+            <a:graphic xmlns:a="http://schemas.openxmlformats.org/drawingml/2006/main">
+              <a:graphicData uri="http://schemas.openxmlformats.org/drawingml/2006/picture">
+                <pic:pic xmlns:pic="http://schemas.openxmlformats.org/drawingml/2006/picture">
+                  <pic:nvPicPr>
+                    <pic:cNvPr id="594937071" name=""/>
+                    <pic:cNvPicPr/>
+                  </pic:nvPicPr>
+                  <pic:blipFill>
+                    <a:blip r:embed="rId13"/>
                     <a:stretch>
                       <a:fillRect/>
                     </a:stretch>
@@ -430,7 +610,7 @@
                   <pic:spPr>
                     <a:xfrm>
                       <a:off x="0" y="0"/>
-                      <a:ext cx="5400040" cy="1189990"/>
+                      <a:ext cx="5400040" cy="1419860"/>
                     </a:xfrm>
                     <a:prstGeom prst="rect">
                       <a:avLst/>
@@ -445,21 +625,61 @@
     </w:p>
     <w:p>
       <w:r>
-        <w:t>As indicated in the protocol flow Eve can intercept Alice’s first message to the server and replace Bob’s ID with her own. The server generates the keys, but now it encrypts it for Eve. So, she can impersonate Bob from this point onwards.</w:t>
-      </w:r>
-      <w:r>
-        <w:t xml:space="preserve"> </w:t>
+        <w:t>In this protocol flow</w:t>
+      </w:r>
+      <w:r>
+        <w:t xml:space="preserve"> chart,</w:t>
+      </w:r>
+      <w:r>
+        <w:t xml:space="preserve"> we can see that the first two messages are uninterrupted and Eve only intervenes when Bob is about to be contacted. Since K’</w:t>
+      </w:r>
+      <w:r>
+        <w:rPr>
+          <w:vertAlign w:val="subscript"/>
+        </w:rPr>
+        <w:t>AB</w:t>
+      </w:r>
+      <w:r>
+        <w:t xml:space="preserve"> is known to Eve from a previous interaction, she can block the message from Alice and replace it with a previous one that used </w:t>
+      </w:r>
+      <w:r>
+        <w:t>K’</w:t>
+      </w:r>
+      <w:r>
+        <w:rPr>
+          <w:vertAlign w:val="subscript"/>
+        </w:rPr>
+        <w:t>AB</w:t>
+      </w:r>
+      <w:r>
+        <w:t xml:space="preserve">. Now Bob </w:t>
+      </w:r>
+      <w:r>
+        <w:t>sends</w:t>
+      </w:r>
+      <w:r>
+        <w:t xml:space="preserve"> back the request with the compromised key, so Eve can decrypt it and send back the nonce in the correct form</w:t>
+      </w:r>
+      <w:r>
+        <w:t>, that Bob will accept as proof of the liveness and Alice’s identity.</w:t>
       </w:r>
     </w:p>
     <w:p>
       <w:pPr>
-        <w:pStyle w:val="Heading2"/>
-      </w:pPr>
-      <w:r>
-        <w:t>Authentication II</w:t>
+        <w:pStyle w:val="Heading1"/>
+      </w:pPr>
+      <w:r>
+        <w:lastRenderedPageBreak/>
+        <w:t>Practical Tasks</w:t>
       </w:r>
     </w:p>
     <w:p>
+      <w:pPr>
+        <w:rPr>
+          <w:i/>
+          <w:iCs/>
+        </w:rPr>
+      </w:pPr>
       <w:r>
         <w:rPr>
           <w:i/>
@@ -472,6 +692,74 @@
           <w:i/>
           <w:iCs/>
         </w:rPr>
+        <w:t>Short introduction)</w:t>
+      </w:r>
+    </w:p>
+    <w:p>
+      <w:r>
+        <w:t>This assignment was completed without the use of AI tools.</w:t>
+      </w:r>
+    </w:p>
+    <w:p>
+      <w:pPr>
+        <w:pStyle w:val="Heading2"/>
+      </w:pPr>
+      <w:r>
+        <w:t>Framework</w:t>
+      </w:r>
+    </w:p>
+    <w:p>
+      <w:pPr>
+        <w:rPr>
+          <w:i/>
+          <w:iCs/>
+        </w:rPr>
+      </w:pPr>
+      <w:r>
+        <w:rPr>
+          <w:i/>
+          <w:iCs/>
+        </w:rPr>
+        <w:t>(Short description about how to set up the environment. Maybe split it up into 2.1.1 Starting the Framework and 2.1.2 Proxy Modules if need)</w:t>
+      </w:r>
+    </w:p>
+    <w:p>
+      <w:pPr>
+        <w:pStyle w:val="Heading2"/>
+      </w:pPr>
+      <w:r>
+        <w:t>Tasks</w:t>
+      </w:r>
+    </w:p>
+    <w:p>
+      <w:r>
+        <w:t xml:space="preserve">Having successfully set up the framework </w:t>
+      </w:r>
+      <w:r>
+        <w:t>we moved onto solving the practical tasks with the protocols.</w:t>
+      </w:r>
+    </w:p>
+    <w:p>
+      <w:pPr>
+        <w:pStyle w:val="Heading3"/>
+      </w:pPr>
+      <w:r>
+        <w:t>Key Establishment</w:t>
+      </w:r>
+    </w:p>
+    <w:p>
+      <w:r>
+        <w:rPr>
+          <w:i/>
+          <w:iCs/>
+        </w:rPr>
+        <w:t>(</w:t>
+      </w:r>
+      <w:r>
+        <w:rPr>
+          <w:i/>
+          <w:iCs/>
+        </w:rPr>
         <w:t>D</w:t>
       </w:r>
       <w:r>
@@ -491,20 +779,13 @@
     </w:p>
     <w:p>
       <w:pPr>
-        <w:pStyle w:val="Heading1"/>
-      </w:pPr>
-      <w:r>
-        <w:lastRenderedPageBreak/>
-        <w:t>Practical Tasks</w:t>
+        <w:pStyle w:val="Heading3"/>
+      </w:pPr>
+      <w:r>
+        <w:t>New User Interface</w:t>
       </w:r>
     </w:p>
     <w:p>
-      <w:pPr>
-        <w:rPr>
-          <w:i/>
-          <w:iCs/>
-        </w:rPr>
-      </w:pPr>
       <w:r>
         <w:rPr>
           <w:i/>
@@ -517,74 +798,6 @@
           <w:i/>
           <w:iCs/>
         </w:rPr>
-        <w:t>Short introduction)</w:t>
-      </w:r>
-    </w:p>
-    <w:p>
-      <w:r>
-        <w:t>This assignment was completed without the use of AI tools.</w:t>
-      </w:r>
-    </w:p>
-    <w:p>
-      <w:pPr>
-        <w:pStyle w:val="Heading2"/>
-      </w:pPr>
-      <w:r>
-        <w:t>Framework</w:t>
-      </w:r>
-    </w:p>
-    <w:p>
-      <w:pPr>
-        <w:rPr>
-          <w:i/>
-          <w:iCs/>
-        </w:rPr>
-      </w:pPr>
-      <w:r>
-        <w:rPr>
-          <w:i/>
-          <w:iCs/>
-        </w:rPr>
-        <w:t>(Short description about how to set up the environment. Maybe split it up into 2.1.1 Starting the Framework and 2.1.2 Proxy Modules if need)</w:t>
-      </w:r>
-    </w:p>
-    <w:p>
-      <w:pPr>
-        <w:pStyle w:val="Heading2"/>
-      </w:pPr>
-      <w:r>
-        <w:t>Tasks</w:t>
-      </w:r>
-    </w:p>
-    <w:p>
-      <w:r>
-        <w:t xml:space="preserve">Having successfully set up the framework </w:t>
-      </w:r>
-      <w:r>
-        <w:t>we moved onto solving the practical tasks with the protocols.</w:t>
-      </w:r>
-    </w:p>
-    <w:p>
-      <w:pPr>
-        <w:pStyle w:val="Heading3"/>
-      </w:pPr>
-      <w:r>
-        <w:t>Key Establishment</w:t>
-      </w:r>
-    </w:p>
-    <w:p>
-      <w:r>
-        <w:rPr>
-          <w:i/>
-          <w:iCs/>
-        </w:rPr>
-        <w:t>(</w:t>
-      </w:r>
-      <w:r>
-        <w:rPr>
-          <w:i/>
-          <w:iCs/>
-        </w:rPr>
         <w:t>D</w:t>
       </w:r>
       <w:r>
@@ -602,47 +815,9 @@
         <w:t xml:space="preserve"> about how to solve the task)</w:t>
       </w:r>
     </w:p>
-    <w:p>
-      <w:pPr>
-        <w:pStyle w:val="Heading3"/>
-      </w:pPr>
-      <w:r>
-        <w:t>New User Interface</w:t>
-      </w:r>
-    </w:p>
-    <w:p>
-      <w:r>
-        <w:rPr>
-          <w:i/>
-          <w:iCs/>
-        </w:rPr>
-        <w:t>(</w:t>
-      </w:r>
-      <w:r>
-        <w:rPr>
-          <w:i/>
-          <w:iCs/>
-        </w:rPr>
-        <w:t>D</w:t>
-      </w:r>
-      <w:r>
-        <w:rPr>
-          <w:i/>
-          <w:iCs/>
-        </w:rPr>
-        <w:t>escription</w:t>
-      </w:r>
-      <w:r>
-        <w:rPr>
-          <w:i/>
-          <w:iCs/>
-        </w:rPr>
-        <w:t xml:space="preserve"> about how to solve the task)</w:t>
-      </w:r>
-    </w:p>
     <w:sectPr>
-      <w:headerReference w:type="even" r:id="rId13"/>
-      <w:footerReference w:type="default" r:id="rId14"/>
+      <w:headerReference w:type="even" r:id="rId14"/>
+      <w:footerReference w:type="default" r:id="rId15"/>
       <w:type w:val="continuous"/>
       <w:pgSz w:w="11907" w:h="16840" w:code="9"/>
       <w:pgMar w:top="1418" w:right="1418" w:bottom="1418" w:left="1418" w:header="709" w:footer="709" w:gutter="567"/>
@@ -6017,7 +6192,6 @@
   <w:style w:type="character" w:default="1" w:styleId="DefaultParagraphFont">
     <w:name w:val="Default Paragraph Font"/>
     <w:uiPriority w:val="1"/>
-    <w:semiHidden/>
     <w:unhideWhenUsed/>
   </w:style>
   <w:style w:type="table" w:default="1" w:styleId="TableNormal">
@@ -7264,15 +7438,6 @@
 </file>
 
 <file path=customXml/item1.xml><?xml version="1.0" encoding="utf-8"?>
-<?mso-contentType ?>
-<FormTemplates xmlns="http://schemas.microsoft.com/sharepoint/v3/contenttype/forms">
-  <Display>DocumentLibraryForm</Display>
-  <Edit>DocumentLibraryForm</Edit>
-  <New>DocumentLibraryForm</New>
-</FormTemplates>
-</file>
-
-<file path=customXml/item2.xml><?xml version="1.0" encoding="utf-8"?>
 <ct:contentTypeSchema xmlns:ct="http://schemas.microsoft.com/office/2006/metadata/contentType" xmlns:ma="http://schemas.microsoft.com/office/2006/metadata/properties/metaAttributes" ct:_="" ma:_="" ma:contentTypeName="Dokumentum" ma:contentTypeID="0x010100804405677F68524E887B9BAD647EC267" ma:contentTypeVersion="17" ma:contentTypeDescription="Új dokumentum létrehozása." ma:contentTypeScope="" ma:versionID="76fc60fa35090df738af56597c20442c">
   <xsd:schema xmlns:xsd="http://www.w3.org/2001/XMLSchema" xmlns:xs="http://www.w3.org/2001/XMLSchema" xmlns:p="http://schemas.microsoft.com/office/2006/metadata/properties" xmlns:ns3="2c71b88f-36ae-449a-8a52-10e2658bdd67" xmlns:ns4="ae689388-e07a-4908-9d5a-df7298fe66fc" targetNamespace="http://schemas.microsoft.com/office/2006/metadata/properties" ma:root="true" ma:fieldsID="b0fbbcf4c3d3a80139dc1bb83a4232cb" ns3:_="" ns4:_="">
     <xsd:import namespace="2c71b88f-36ae-449a-8a52-10e2658bdd67"/>
@@ -7519,7 +7684,24 @@
 </ct:contentTypeSchema>
 </file>
 
+<file path=customXml/item2.xml><?xml version="1.0" encoding="utf-8"?>
+<?mso-contentType ?>
+<FormTemplates xmlns="http://schemas.microsoft.com/sharepoint/v3/contenttype/forms">
+  <Display>DocumentLibraryForm</Display>
+  <Edit>DocumentLibraryForm</Edit>
+  <New>DocumentLibraryForm</New>
+</FormTemplates>
+</file>
+
 <file path=customXml/item3.xml><?xml version="1.0" encoding="utf-8"?>
+<p:properties xmlns:p="http://schemas.microsoft.com/office/2006/metadata/properties" xmlns:xsi="http://www.w3.org/2001/XMLSchema-instance" xmlns:pc="http://schemas.microsoft.com/office/infopath/2007/PartnerControls">
+  <documentManagement>
+    <_activity xmlns="2c71b88f-36ae-449a-8a52-10e2658bdd67" xsi:nil="true"/>
+  </documentManagement>
+</p:properties>
+</file>
+
+<file path=customXml/item4.xml><?xml version="1.0" encoding="utf-8"?>
 <b:Sources xmlns:b="http://schemas.openxmlformats.org/officeDocument/2006/bibliography" xmlns="http://schemas.openxmlformats.org/officeDocument/2006/bibliography" SelectedStyle="\IEEE2006OfficeOnline.xsl" StyleName="IEEE" Version="2006">
   <b:Source>
     <b:Tag>Mic24</b:Tag>
@@ -7718,23 +7900,7 @@
 </b:Sources>
 </file>
 
-<file path=customXml/item4.xml><?xml version="1.0" encoding="utf-8"?>
-<p:properties xmlns:p="http://schemas.microsoft.com/office/2006/metadata/properties" xmlns:xsi="http://www.w3.org/2001/XMLSchema-instance" xmlns:pc="http://schemas.microsoft.com/office/infopath/2007/PartnerControls">
-  <documentManagement>
-    <_activity xmlns="2c71b88f-36ae-449a-8a52-10e2658bdd67" xsi:nil="true"/>
-  </documentManagement>
-</p:properties>
-</file>
-
 <file path=customXml/itemProps1.xml><?xml version="1.0" encoding="utf-8"?>
-<ds:datastoreItem xmlns:ds="http://schemas.openxmlformats.org/officeDocument/2006/customXml" ds:itemID="{BFA6786E-AF7B-4A38-BBCA-BF31ECFEA1DF}">
-  <ds:schemaRefs>
-    <ds:schemaRef ds:uri="http://schemas.microsoft.com/sharepoint/v3/contenttype/forms"/>
-  </ds:schemaRefs>
-</ds:datastoreItem>
-</file>
-
-<file path=customXml/itemProps2.xml><?xml version="1.0" encoding="utf-8"?>
 <ds:datastoreItem xmlns:ds="http://schemas.openxmlformats.org/officeDocument/2006/customXml" ds:itemID="{0B5E8B16-0AFB-408B-BF8C-70E4A1B923B3}">
   <ds:schemaRefs>
     <ds:schemaRef ds:uri="http://schemas.microsoft.com/office/2006/metadata/contentType"/>
@@ -7753,15 +7919,15 @@
 </ds:datastoreItem>
 </file>
 
-<file path=customXml/itemProps3.xml><?xml version="1.0" encoding="utf-8"?>
-<ds:datastoreItem xmlns:ds="http://schemas.openxmlformats.org/officeDocument/2006/customXml" ds:itemID="{C30AA391-316B-4E95-AE8C-64681E201677}">
+<file path=customXml/itemProps2.xml><?xml version="1.0" encoding="utf-8"?>
+<ds:datastoreItem xmlns:ds="http://schemas.openxmlformats.org/officeDocument/2006/customXml" ds:itemID="{BFA6786E-AF7B-4A38-BBCA-BF31ECFEA1DF}">
   <ds:schemaRefs>
-    <ds:schemaRef ds:uri="http://schemas.openxmlformats.org/officeDocument/2006/bibliography"/>
+    <ds:schemaRef ds:uri="http://schemas.microsoft.com/sharepoint/v3/contenttype/forms"/>
   </ds:schemaRefs>
 </ds:datastoreItem>
 </file>
 
-<file path=customXml/itemProps4.xml><?xml version="1.0" encoding="utf-8"?>
+<file path=customXml/itemProps3.xml><?xml version="1.0" encoding="utf-8"?>
 <ds:datastoreItem xmlns:ds="http://schemas.openxmlformats.org/officeDocument/2006/customXml" ds:itemID="{5283BDE5-2110-47A1-B6BF-261D767F66A4}">
   <ds:schemaRefs>
     <ds:schemaRef ds:uri="http://schemas.microsoft.com/office/2006/metadata/properties"/>
@@ -7769,4 +7935,12 @@
     <ds:schemaRef ds:uri="2c71b88f-36ae-449a-8a52-10e2658bdd67"/>
   </ds:schemaRefs>
 </ds:datastoreItem>
+</file>
+
+<file path=customXml/itemProps4.xml><?xml version="1.0" encoding="utf-8"?>
+<ds:datastoreItem xmlns:ds="http://schemas.openxmlformats.org/officeDocument/2006/customXml" ds:itemID="{C30AA391-316B-4E95-AE8C-64681E201677}">
+  <ds:schemaRefs>
+    <ds:schemaRef ds:uri="http://schemas.openxmlformats.org/officeDocument/2006/bibliography"/>
+  </ds:schemaRefs>
+</ds:datastoreItem>
 </file>
</xml_diff>